<commit_message>
feat: chnaged the logo and pdf
</commit_message>
<xml_diff>
--- a/public/DUE_DILIGENCE_FORM_branded.docx
+++ b/public/DUE_DILIGENCE_FORM_branded.docx
@@ -2,12 +2,14 @@
 <file path=word/document.xml><?xml version="1.0" encoding="utf-8"?>
 <w:document xmlns:wpc="http://schemas.microsoft.com/office/word/2010/wordprocessingCanvas" xmlns:cx="http://schemas.microsoft.com/office/drawing/2014/chartex" xmlns:cx1="http://schemas.microsoft.com/office/drawing/2015/9/8/chartex" xmlns:cx2="http://schemas.microsoft.com/office/drawing/2015/10/21/chartex" xmlns:cx3="http://schemas.microsoft.com/office/drawing/2016/5/9/chartex" xmlns:cx4="http://schemas.microsoft.com/office/drawing/2016/5/10/chartex" xmlns:cx5="http://schemas.microsoft.com/office/drawing/2016/5/11/chartex" xmlns:cx6="http://schemas.microsoft.com/office/drawing/2016/5/12/chartex" xmlns:cx7="http://schemas.microsoft.com/office/drawing/2016/5/13/chartex" xmlns:cx8="http://schemas.microsoft.com/office/drawing/2016/5/14/chartex" xmlns:mc="http://schemas.openxmlformats.org/markup-compatibility/2006" xmlns:aink="http://schemas.microsoft.com/office/drawing/2016/ink" xmlns:am3d="http://schemas.microsoft.com/office/drawing/2017/model3d" xmlns:o="urn:schemas-microsoft-com:office:office" xmlns:oel="http://schemas.microsoft.com/office/2019/extlst" xmlns:r="http://schemas.openxmlformats.org/officeDocument/2006/relationships" xmlns:m="http://schemas.openxmlformats.org/officeDocument/2006/math" xmlns:v="urn:schemas-microsoft-com:vml" xmlns:wp14="http://schemas.microsoft.com/office/word/2010/wordprocessingDrawing" xmlns:wp="http://schemas.openxmlformats.org/drawingml/2006/wordprocessingDrawing" xmlns:w10="urn:schemas-microsoft-com:office:word" xmlns:w="http://schemas.openxmlformats.org/wordprocessingml/2006/main" xmlns:w14="http://schemas.microsoft.com/office/word/2010/wordml" xmlns:w15="http://schemas.microsoft.com/office/word/2012/wordml" xmlns:w16cex="http://schemas.microsoft.com/office/word/2018/wordml/cex" xmlns:w16cid="http://schemas.microsoft.com/office/word/2016/wordml/cid" xmlns:w16="http://schemas.microsoft.com/office/word/2018/wordml" xmlns:w16du="http://schemas.microsoft.com/office/word/2023/wordml/word16du" xmlns:w16sdtdh="http://schemas.microsoft.com/office/word/2020/wordml/sdtdatahash" xmlns:w16sdtfl="http://schemas.microsoft.com/office/word/2024/wordml/sdtformatlock" xmlns:w16se="http://schemas.microsoft.com/office/word/2015/wordml/symex" xmlns:wpg="http://schemas.microsoft.com/office/word/2010/wordprocessingGroup" xmlns:wpi="http://schemas.microsoft.com/office/word/2010/wordprocessingInk" xmlns:wne="http://schemas.microsoft.com/office/word/2006/wordml" xmlns:wps="http://schemas.microsoft.com/office/word/2010/wordprocessingShape" mc:Ignorable="w14 w15 w16se w16cid w16 w16cex w16sdtdh w16sdtfl w16du wp14">
   <w:body>
-    <w:p/>
     <w:p>
+      <w:pPr>
+        <w:jc w:val="center"/>
+      </w:pPr>
       <w:r>
         <w:drawing>
           <wp:inline xmlns:a="http://schemas.openxmlformats.org/drawingml/2006/main" xmlns:pic="http://schemas.openxmlformats.org/drawingml/2006/picture">
-            <wp:extent cx="365760" cy="420624"/>
+            <wp:extent cx="731520" cy="709845"/>
             <wp:docPr id="1" name="Picture 1"/>
             <wp:cNvGraphicFramePr>
               <a:graphicFrameLocks noChangeAspect="1"/>
@@ -16,7 +18,7 @@
               <a:graphicData uri="http://schemas.openxmlformats.org/drawingml/2006/picture">
                 <pic:pic>
                   <pic:nvPicPr>
-                    <pic:cNvPr id="0" name="logo-brand.png"/>
+                    <pic:cNvPr id="0" name="logo2.png"/>
                     <pic:cNvPicPr/>
                   </pic:nvPicPr>
                   <pic:blipFill>
@@ -28,7 +30,7 @@
                   <pic:spPr>
                     <a:xfrm>
                       <a:off x="0" y="0"/>
-                      <a:ext cx="365760" cy="420624"/>
+                      <a:ext cx="731520" cy="709845"/>
                     </a:xfrm>
                     <a:prstGeom prst="rect"/>
                   </pic:spPr>
@@ -41,10 +43,46 @@
       <w:r>
         <w:rPr>
           <w:b/>
-          <w:color w:val="185A9D"/>
-          <w:sz w:val="32"/>
+          <w:color w:val="24959A"/>
+          <w:sz w:val="48"/>
         </w:rPr>
-        <w:t xml:space="preserve"> TradeBlottr</w:t>
+        <w:t xml:space="preserve"> Peniwyse</w:t>
+      </w:r>
+    </w:p>
+    <w:p>
+      <w:pPr>
+        <w:jc w:val="center"/>
+      </w:pPr>
+      <w:r>
+        <w:rPr>
+          <w:b/>
+          <w:sz w:val="28"/>
+        </w:rPr>
+        <w:t>Peniwyse AML Due Diligence Questionnaire</w:t>
+      </w:r>
+    </w:p>
+    <w:p>
+      <w:pPr>
+        <w:jc w:val="center"/>
+      </w:pPr>
+      <w:r>
+        <w:rPr>
+          <w:sz w:val="20"/>
+        </w:rPr>
+        <w:t>This questionnaire is required for prospective banking partners, financial institutions, cryptocurrency exchanges, investment firms, etc. The information collected on this form is part of the due diligence process at Peniwyse.</w:t>
+      </w:r>
+    </w:p>
+    <w:p/>
+    <w:p>
+      <w:pPr>
+        <w:jc w:val="right"/>
+      </w:pPr>
+      <w:r>
+        <w:rPr>
+          <w:i/>
+          <w:sz w:val="16"/>
+        </w:rPr>
+        <w:t>Please tick appropriate response</w:t>
       </w:r>
     </w:p>
     <w:p>
@@ -86,7 +124,7 @@
               <w:bottom w:val="single" w:sz="6" w:space="0" w:color="000000"/>
               <w:right w:val="single" w:sz="6" w:space="0" w:color="000000"/>
             </w:tcBorders>
-            <w:shd w:val="clear" w:color="auto" w:fill="185A9D"/>
+            <w:shd w:val="clear" w:color="auto" w:fill="24959A"/>
           </w:tcPr>
           <w:p>
             <w:pPr>
@@ -122,7 +160,7 @@
               <w:bottom w:val="single" w:sz="6" w:space="0" w:color="000000"/>
               <w:right w:val="single" w:sz="6" w:space="0" w:color="000000"/>
             </w:tcBorders>
-            <w:shd w:val="clear" w:color="auto" w:fill="185A9D"/>
+            <w:shd w:val="clear" w:color="auto" w:fill="24959A"/>
           </w:tcPr>
           <w:p>
             <w:pPr>
@@ -148,7 +186,7 @@
               <w:bottom w:val="single" w:sz="6" w:space="0" w:color="000000"/>
               <w:right w:val="single" w:sz="6" w:space="0" w:color="000000"/>
             </w:tcBorders>
-            <w:shd w:val="clear" w:color="auto" w:fill="185A9D"/>
+            <w:shd w:val="clear" w:color="auto" w:fill="24959A"/>
           </w:tcPr>
           <w:p>
             <w:pPr>
@@ -542,7 +580,7 @@
               <w:bottom w:val="single" w:sz="6" w:space="0" w:color="000000"/>
               <w:right w:val="single" w:sz="6" w:space="0" w:color="000000"/>
             </w:tcBorders>
-            <w:shd w:val="clear" w:color="auto" w:fill="185A9D"/>
+            <w:shd w:val="clear" w:color="auto" w:fill="24959A"/>
           </w:tcPr>
           <w:p>
             <w:pPr>
@@ -578,7 +616,7 @@
               <w:bottom w:val="single" w:sz="6" w:space="0" w:color="000000"/>
               <w:right w:val="single" w:sz="6" w:space="0" w:color="000000"/>
             </w:tcBorders>
-            <w:shd w:val="clear" w:color="auto" w:fill="185A9D"/>
+            <w:shd w:val="clear" w:color="auto" w:fill="24959A"/>
           </w:tcPr>
           <w:p>
             <w:pPr>
@@ -616,7 +654,7 @@
               <w:bottom w:val="single" w:sz="6" w:space="0" w:color="000000"/>
               <w:right w:val="single" w:sz="6" w:space="0" w:color="000000"/>
             </w:tcBorders>
-            <w:shd w:val="clear" w:color="auto" w:fill="185A9D"/>
+            <w:shd w:val="clear" w:color="auto" w:fill="24959A"/>
           </w:tcPr>
           <w:p>
             <w:pPr>
@@ -2211,7 +2249,7 @@
               <w:bottom w:val="single" w:sz="6" w:space="0" w:color="000000"/>
               <w:right w:val="single" w:sz="6" w:space="0" w:color="000000"/>
             </w:tcBorders>
-            <w:shd w:val="clear" w:color="auto" w:fill="185A9D"/>
+            <w:shd w:val="clear" w:color="auto" w:fill="24959A"/>
           </w:tcPr>
           <w:p>
             <w:pPr>
@@ -2247,7 +2285,7 @@
               <w:bottom w:val="single" w:sz="6" w:space="0" w:color="000000"/>
               <w:right w:val="single" w:sz="6" w:space="0" w:color="000000"/>
             </w:tcBorders>
-            <w:shd w:val="clear" w:color="auto" w:fill="185A9D"/>
+            <w:shd w:val="clear" w:color="auto" w:fill="24959A"/>
           </w:tcPr>
           <w:p>
             <w:pPr>
@@ -2285,7 +2323,7 @@
               <w:bottom w:val="single" w:sz="6" w:space="0" w:color="000000"/>
               <w:right w:val="single" w:sz="6" w:space="0" w:color="000000"/>
             </w:tcBorders>
-            <w:shd w:val="clear" w:color="auto" w:fill="185A9D"/>
+            <w:shd w:val="clear" w:color="auto" w:fill="24959A"/>
           </w:tcPr>
           <w:p>
             <w:pPr>
@@ -2758,7 +2796,7 @@
               <w:bottom w:val="single" w:sz="6" w:space="0" w:color="000000"/>
               <w:right w:val="single" w:sz="6" w:space="0" w:color="000000"/>
             </w:tcBorders>
-            <w:shd w:val="clear" w:color="auto" w:fill="185A9D"/>
+            <w:shd w:val="clear" w:color="auto" w:fill="24959A"/>
           </w:tcPr>
           <w:p>
             <w:pPr>
@@ -2795,7 +2833,7 @@
               <w:bottom w:val="single" w:sz="6" w:space="0" w:color="000000"/>
               <w:right w:val="single" w:sz="6" w:space="0" w:color="000000"/>
             </w:tcBorders>
-            <w:shd w:val="clear" w:color="auto" w:fill="185A9D"/>
+            <w:shd w:val="clear" w:color="auto" w:fill="24959A"/>
           </w:tcPr>
           <w:p>
             <w:pPr>
@@ -2833,7 +2871,7 @@
               <w:bottom w:val="single" w:sz="6" w:space="0" w:color="000000"/>
               <w:right w:val="single" w:sz="6" w:space="0" w:color="000000"/>
             </w:tcBorders>
-            <w:shd w:val="clear" w:color="auto" w:fill="185A9D"/>
+            <w:shd w:val="clear" w:color="auto" w:fill="24959A"/>
           </w:tcPr>
           <w:p>
             <w:pPr>
@@ -3519,7 +3557,7 @@
               <w:bottom w:val="single" w:sz="6" w:space="0" w:color="000000"/>
               <w:right w:val="single" w:sz="6" w:space="0" w:color="000000"/>
             </w:tcBorders>
-            <w:shd w:val="clear" w:color="auto" w:fill="185A9D"/>
+            <w:shd w:val="clear" w:color="auto" w:fill="24959A"/>
           </w:tcPr>
           <w:p>
             <w:pPr>
@@ -3555,7 +3593,7 @@
               <w:bottom w:val="single" w:sz="6" w:space="0" w:color="000000"/>
               <w:right w:val="single" w:sz="6" w:space="0" w:color="000000"/>
             </w:tcBorders>
-            <w:shd w:val="clear" w:color="auto" w:fill="185A9D"/>
+            <w:shd w:val="clear" w:color="auto" w:fill="24959A"/>
           </w:tcPr>
           <w:p>
             <w:pPr>
@@ -3593,7 +3631,7 @@
               <w:bottom w:val="single" w:sz="6" w:space="0" w:color="000000"/>
               <w:right w:val="single" w:sz="6" w:space="0" w:color="000000"/>
             </w:tcBorders>
-            <w:shd w:val="clear" w:color="auto" w:fill="185A9D"/>
+            <w:shd w:val="clear" w:color="auto" w:fill="24959A"/>
           </w:tcPr>
           <w:p>
             <w:pPr>
@@ -4529,7 +4567,7 @@
               <w:bottom w:val="single" w:sz="6" w:space="0" w:color="000000"/>
               <w:right w:val="single" w:sz="6" w:space="0" w:color="000000"/>
             </w:tcBorders>
-            <w:shd w:val="clear" w:color="auto" w:fill="185A9D"/>
+            <w:shd w:val="clear" w:color="auto" w:fill="24959A"/>
           </w:tcPr>
           <w:p>
             <w:pPr>
@@ -4565,7 +4603,7 @@
               <w:bottom w:val="single" w:sz="6" w:space="0" w:color="000000"/>
               <w:right w:val="single" w:sz="6" w:space="0" w:color="000000"/>
             </w:tcBorders>
-            <w:shd w:val="clear" w:color="auto" w:fill="185A9D"/>
+            <w:shd w:val="clear" w:color="auto" w:fill="24959A"/>
           </w:tcPr>
           <w:p>
             <w:pPr>
@@ -4603,7 +4641,7 @@
               <w:bottom w:val="single" w:sz="6" w:space="0" w:color="000000"/>
               <w:right w:val="single" w:sz="6" w:space="0" w:color="000000"/>
             </w:tcBorders>
-            <w:shd w:val="clear" w:color="auto" w:fill="185A9D"/>
+            <w:shd w:val="clear" w:color="auto" w:fill="24959A"/>
           </w:tcPr>
           <w:p>
             <w:pPr>
@@ -4998,7 +5036,7 @@
               <w:bottom w:val="single" w:sz="6" w:space="0" w:color="000000"/>
               <w:right w:val="single" w:sz="6" w:space="0" w:color="000000"/>
             </w:tcBorders>
-            <w:shd w:val="clear" w:color="auto" w:fill="185A9D"/>
+            <w:shd w:val="clear" w:color="auto" w:fill="24959A"/>
           </w:tcPr>
           <w:p>
             <w:pPr>
@@ -5023,7 +5061,7 @@
               <w:bottom w:val="single" w:sz="6" w:space="0" w:color="000000"/>
               <w:right w:val="single" w:sz="6" w:space="0" w:color="000000"/>
             </w:tcBorders>
-            <w:shd w:val="clear" w:color="auto" w:fill="185A9D"/>
+            <w:shd w:val="clear" w:color="auto" w:fill="24959A"/>
           </w:tcPr>
           <w:p>
             <w:pPr>
@@ -5088,7 +5126,7 @@
               <w:bottom w:val="single" w:sz="6" w:space="0" w:color="000000"/>
               <w:right w:val="single" w:sz="6" w:space="0" w:color="000000"/>
             </w:tcBorders>
-            <w:shd w:val="clear" w:color="auto" w:fill="185A9D"/>
+            <w:shd w:val="clear" w:color="auto" w:fill="24959A"/>
           </w:tcPr>
           <w:p>
             <w:pPr>
@@ -5122,7 +5160,7 @@
               <w:bottom w:val="single" w:sz="6" w:space="0" w:color="000000"/>
               <w:right w:val="single" w:sz="6" w:space="0" w:color="000000"/>
             </w:tcBorders>
-            <w:shd w:val="clear" w:color="auto" w:fill="185A9D"/>
+            <w:shd w:val="clear" w:color="auto" w:fill="24959A"/>
           </w:tcPr>
           <w:p>
             <w:pPr>
@@ -5773,7 +5811,7 @@
               <w:bottom w:val="single" w:sz="6" w:space="0" w:color="000000"/>
               <w:right w:val="single" w:sz="6" w:space="0" w:color="000000"/>
             </w:tcBorders>
-            <w:shd w:val="clear" w:color="auto" w:fill="185A9D"/>
+            <w:shd w:val="clear" w:color="auto" w:fill="24959A"/>
           </w:tcPr>
           <w:p>
             <w:pPr>
@@ -5799,7 +5837,7 @@
               <w:bottom w:val="single" w:sz="6" w:space="0" w:color="000000"/>
               <w:right w:val="single" w:sz="6" w:space="0" w:color="000000"/>
             </w:tcBorders>
-            <w:shd w:val="clear" w:color="auto" w:fill="185A9D"/>
+            <w:shd w:val="clear" w:color="auto" w:fill="24959A"/>
           </w:tcPr>
           <w:p>
             <w:pPr>
@@ -5833,7 +5871,7 @@
               <w:bottom w:val="single" w:sz="6" w:space="0" w:color="000000"/>
               <w:right w:val="single" w:sz="6" w:space="0" w:color="000000"/>
             </w:tcBorders>
-            <w:shd w:val="clear" w:color="auto" w:fill="185A9D"/>
+            <w:shd w:val="clear" w:color="auto" w:fill="24959A"/>
           </w:tcPr>
           <w:p>
             <w:pPr>

</xml_diff>